<commit_message>
docs: README for GitHub, report section 9 and demo script updated for the new UI, repo link
Co-Authored-By: Claude Opus 5.5 (1M context) <noreply@anthropic.com>
</commit_message>
<xml_diff>
--- a/reports/report/bao_cao_project13.docx
+++ b/reports/report/bao_cao_project13.docx
@@ -227,7 +227,7 @@
       </w:r>
       <w:r>
         <w:tab/>
-        <w:t xml:space="preserve">&lt;link repo&gt;</w:t>
+        <w:t xml:space="preserve">github.com/Nguyenvan01/hotel-booking-cancellation-prediction</w:t>
       </w:r>
     </w:p>
     <w:p>
@@ -1288,7 +1288,7 @@
           <w:sz w:val="23"/>
           <w:szCs w:val="23"/>
         </w:rPr>
-        <w:t xml:space="preserve">9.3 Ba màn hình</w:t>
+        <w:t xml:space="preserve">9.3 Giao diện</w:t>
       </w:r>
       <w:r>
         <w:rPr>
@@ -1322,7 +1322,7 @@
           <w:szCs w:val="23"/>
         </w:rPr>
         <w:tab/>
-        <w:t xml:space="preserve">22</w:t>
+        <w:t xml:space="preserve">21</w:t>
       </w:r>
     </w:p>
     <w:p>
@@ -1400,7 +1400,7 @@
           <w:szCs w:val="23"/>
         </w:rPr>
         <w:tab/>
-        <w:t xml:space="preserve">23</w:t>
+        <w:t xml:space="preserve">22</w:t>
       </w:r>
     </w:p>
     <w:p>
@@ -1426,7 +1426,7 @@
           <w:szCs w:val="23"/>
         </w:rPr>
         <w:tab/>
-        <w:t xml:space="preserve">23</w:t>
+        <w:t xml:space="preserve">22</w:t>
       </w:r>
     </w:p>
     <w:p>
@@ -1478,7 +1478,7 @@
           <w:szCs w:val="23"/>
         </w:rPr>
         <w:tab/>
-        <w:t xml:space="preserve">25</w:t>
+        <w:t xml:space="preserve">24</w:t>
       </w:r>
     </w:p>
     <w:p>
@@ -1504,7 +1504,7 @@
           <w:szCs w:val="23"/>
         </w:rPr>
         <w:tab/>
-        <w:t xml:space="preserve">26</w:t>
+        <w:t xml:space="preserve">25</w:t>
       </w:r>
     </w:p>
     <w:p>
@@ -1530,7 +1530,7 @@
           <w:szCs w:val="23"/>
         </w:rPr>
         <w:tab/>
-        <w:t xml:space="preserve">27</w:t>
+        <w:t xml:space="preserve">26</w:t>
       </w:r>
     </w:p>
     <w:p>
@@ -1556,7 +1556,7 @@
           <w:szCs w:val="23"/>
         </w:rPr>
         <w:tab/>
-        <w:t xml:space="preserve">28</w:t>
+        <w:t xml:space="preserve">27</w:t>
       </w:r>
     </w:p>
     <w:p>
@@ -1582,7 +1582,7 @@
           <w:szCs w:val="23"/>
         </w:rPr>
         <w:tab/>
-        <w:t xml:space="preserve">29</w:t>
+        <w:t xml:space="preserve">28</w:t>
       </w:r>
     </w:p>
     <w:p>
@@ -1608,7 +1608,7 @@
           <w:szCs w:val="23"/>
         </w:rPr>
         <w:tab/>
-        <w:t xml:space="preserve">30</w:t>
+        <w:t xml:space="preserve">29</w:t>
       </w:r>
     </w:p>
     <w:p>
@@ -1634,7 +1634,7 @@
           <w:szCs w:val="23"/>
         </w:rPr>
         <w:tab/>
-        <w:t xml:space="preserve">31</w:t>
+        <w:t xml:space="preserve">30</w:t>
       </w:r>
     </w:p>
     <w:p>
@@ -1755,7 +1755,7 @@
         <w:t xml:space="preserve">ROC-AUC 0,727</w:t>
       </w:r>
       <w:r>
-        <w:t xml:space="preserve"> (khoảng tin cậy 95%: 0,709–0,748), PR-AUC 0,674, log loss 0,583, vượt cả hai baseline (logistic chỉ với lead time: ROC-AUC 0,619; tỷ lệ hủy chung: log loss 0,679). Xác suất được hiệu chỉnh tốt ở mức tổng thể (trung bình dự đoán 39,5% so với tỷ lệ thực tế 40,6%). Ba ngưỡng hành động chọn trên validation cho phép đánh đổi giữa bắt được 91% booking hủy (gắn cờ 76% booking) và precision 0,70 khi chỉ gắn cờ khoảng 20%. Hiệu năng giảm so với validation (ROC-AUC 0,783) do trôi theo thời gian, yếu hơn ở nhóm Online TA và dự đoán thấp cho Resort Hotel. Mô hình được đóng gói thành ứng dụng web FastAPI ba màn hình, có kiểm tra đầu vào, cảnh báo ngoài miền và model card.</w:t>
+        <w:t xml:space="preserve"> (khoảng tin cậy 95%: 0,709–0,748), PR-AUC 0,674, log loss 0,583, vượt cả hai baseline (logistic chỉ với lead time: ROC-AUC 0,619; tỷ lệ hủy chung: log loss 0,679). Xác suất được hiệu chỉnh tốt ở mức tổng thể (trung bình dự đoán 39,5% so với tỷ lệ thực tế 40,6%). Ba ngưỡng hành động chọn trên validation cho phép đánh đổi giữa bắt được 91% booking hủy (gắn cờ 76% booking) và precision 0,70 khi chỉ gắn cờ khoảng 20%. Hiệu năng giảm so với validation (ROC-AUC 0,783) do trôi theo thời gian, yếu hơn ở nhóm Online TA và dự đoán thấp cho Resort Hotel. Mô hình được đóng gói thành ứng dụng web (FastAPI + React) có kiểm tra đầu vào, cảnh báo ngoài miền, dashboard đánh giá và model card.</w:t>
       </w:r>
     </w:p>
     <w:p>
@@ -2593,7 +2593,7 @@
         <w:t xml:space="preserve">make all</w:t>
       </w:r>
       <w:r>
-        <w:t xml:space="preserve">), có kiểm tra checksum và 40 test tự động.</w:t>
+        <w:t xml:space="preserve">), có kiểm tra checksum, 51 test tự động và kiểm thử end-to-end trên trình duyệt.</w:t>
       </w:r>
     </w:p>
     <w:p>
@@ -21596,7 +21596,7 @@
         <w:jc w:val="both"/>
       </w:pPr>
       <w:r>
-        <w:t xml:space="preserve">Ứng dụng dùng </w:t>
+        <w:t xml:space="preserve">Backend dùng </w:t>
       </w:r>
       <w:r>
         <w:rPr>
@@ -21606,7 +21606,7 @@
         <w:t xml:space="preserve">FastAPI</w:t>
       </w:r>
       <w:r>
-        <w:t xml:space="preserve"> (Python) với giao diện HTML/CSS/JavaScript thuần, không dùng cơ sở dữ liệu. Huấn luyện chạy offline (</w:t>
+        <w:t xml:space="preserve"> (Python), không dùng cơ sở dữ liệu. Huấn luyện chạy offline (</w:t>
       </w:r>
       <w:r>
         <w:rPr>
@@ -21628,7 +21628,7 @@
         <w:t xml:space="preserve">models/model.joblib</w:t>
       </w:r>
       <w:r>
-        <w:t xml:space="preserve">, </w:t>
+        <w:t xml:space="preserve"> và </w:t>
       </w:r>
       <w:r>
         <w:rPr>
@@ -21639,7 +21639,17 @@
         <w:t xml:space="preserve">config.json</w:t>
       </w:r>
       <w:r>
-        <w:t xml:space="preserve"> và </w:t>
+        <w:t xml:space="preserve">, không huấn luyện lại ở mỗi request. Các endpoint GET </w:t>
+      </w:r>
+      <w:r>
+        <w:rPr>
+          <w:b/>
+          <w:bCs/>
+        </w:rPr>
+        <w:t xml:space="preserve">chỉ đọc file đã sinh</w:t>
+      </w:r>
+      <w:r>
+        <w:t xml:space="preserve"> (</w:t>
       </w:r>
       <w:r>
         <w:rPr>
@@ -21647,10 +21657,73 @@
           <w:sz w:val="22"/>
           <w:szCs w:val="22"/>
         </w:rPr>
-        <w:t xml:space="preserve">metrics.json</w:t>
-      </w:r>
-      <w:r>
-        <w:t xml:space="preserve">, không huấn luyện lại ở mỗi request. App không lưu và không ghi log nội dung booking; handler lỗi 500 chỉ ghi đường dẫn và trả thông điệp an toàn.</w:t>
+        <w:t xml:space="preserve">models/metrics.json</w:t>
+      </w:r>
+      <w:r>
+        <w:t xml:space="preserve">, </w:t>
+      </w:r>
+      <w:r>
+        <w:rPr>
+          <w:rFonts w:ascii="Courier New" w:cs="Courier New" w:eastAsia="Courier New" w:hAnsi="Courier New"/>
+          <w:sz w:val="22"/>
+          <w:szCs w:val="22"/>
+        </w:rPr>
+        <w:t xml:space="preserve">reports/curves.json</w:t>
+      </w:r>
+      <w:r>
+        <w:t xml:space="preserve">, </w:t>
+      </w:r>
+      <w:r>
+        <w:rPr>
+          <w:rFonts w:ascii="Courier New" w:cs="Courier New" w:eastAsia="Courier New" w:hAnsi="Courier New"/>
+          <w:sz w:val="22"/>
+          <w:szCs w:val="22"/>
+        </w:rPr>
+        <w:t xml:space="preserve">reports/*.csv</w:t>
+      </w:r>
+      <w:r>
+        <w:t xml:space="preserve">, model card), không tính lại. App không lưu và không ghi log nội dung booking; handler lỗi 500 chỉ ghi đường dẫn và trả thông điệp an toàn.</w:t>
+      </w:r>
+    </w:p>
+    <w:p>
+      <w:pPr>
+        <w:spacing w:after="120" w:line="312"/>
+        <w:jc w:val="both"/>
+      </w:pPr>
+      <w:r>
+        <w:t xml:space="preserve">Giao diện viết bằng </w:t>
+      </w:r>
+      <w:r>
+        <w:rPr>
+          <w:b/>
+          <w:bCs/>
+        </w:rPr>
+        <w:t xml:space="preserve">React + TypeScript</w:t>
+      </w:r>
+      <w:r>
+        <w:t xml:space="preserve"> (Vite, Tailwind CSS v4, shadcn/ui trên Base UI, TanStack Query/Table, React Hook Form + Zod, Recharts, motion), build sẵn vào </w:t>
+      </w:r>
+      <w:r>
+        <w:rPr>
+          <w:rFonts w:ascii="Courier New" w:cs="Courier New" w:eastAsia="Courier New" w:hAnsi="Courier New"/>
+          <w:sz w:val="22"/>
+          <w:szCs w:val="22"/>
+        </w:rPr>
+        <w:t xml:space="preserve">app/web</w:t>
+      </w:r>
+      <w:r>
+        <w:t xml:space="preserve"> và được FastAPI phục vụ cùng cổng, nên </w:t>
+      </w:r>
+      <w:r>
+        <w:rPr>
+          <w:rFonts w:ascii="Courier New" w:cs="Courier New" w:eastAsia="Courier New" w:hAnsi="Courier New"/>
+          <w:sz w:val="22"/>
+          <w:szCs w:val="22"/>
+        </w:rPr>
+        <w:t xml:space="preserve">make app</w:t>
+      </w:r>
+      <w:r>
+        <w:t xml:space="preserve"> chạy được ngay mà không cần Node.js. UI chỉ gọi API, không chứa logic mô hình; mọi số liệu và biểu đồ lấy từ API, thiếu thì hiển thị trạng thái rỗng thay vì dữ liệu giả.</w:t>
       </w:r>
     </w:p>
     <w:p>
@@ -21698,8 +21771,8 @@
         </w:tblBorders>
       </w:tblPr>
       <w:tblGrid>
-        <w:gridCol w:w="2591"/>
-        <w:gridCol w:w="6480"/>
+        <w:gridCol w:w="2705"/>
+        <w:gridCol w:w="6366"/>
       </w:tblGrid>
       <w:tr>
         <w:trPr>
@@ -21707,7 +21780,7 @@
         </w:trPr>
         <w:tc>
           <w:tcPr>
-            <w:tcW w:type="dxa" w:w="2591"/>
+            <w:tcW w:type="dxa" w:w="2705"/>
             <w:tcBorders>
               <w:top w:val="single" w:color="BFBFBF" w:sz="4"/>
               <w:left w:val="single" w:color="BFBFBF" w:sz="4"/>
@@ -21739,7 +21812,7 @@
         </w:tc>
         <w:tc>
           <w:tcPr>
-            <w:tcW w:type="dxa" w:w="6480"/>
+            <w:tcW w:type="dxa" w:w="6366"/>
             <w:tcBorders>
               <w:top w:val="single" w:color="BFBFBF" w:sz="4"/>
               <w:left w:val="single" w:color="BFBFBF" w:sz="4"/>
@@ -21776,7 +21849,7 @@
         </w:trPr>
         <w:tc>
           <w:tcPr>
-            <w:tcW w:type="dxa" w:w="2591"/>
+            <w:tcW w:type="dxa" w:w="2705"/>
             <w:tcBorders>
               <w:top w:val="single" w:color="BFBFBF" w:sz="4"/>
               <w:left w:val="single" w:color="BFBFBF" w:sz="4"/>
@@ -21808,7 +21881,7 @@
         </w:tc>
         <w:tc>
           <w:tcPr>
-            <w:tcW w:type="dxa" w:w="6480"/>
+            <w:tcW w:type="dxa" w:w="6366"/>
             <w:tcBorders>
               <w:top w:val="single" w:color="BFBFBF" w:sz="4"/>
               <w:left w:val="single" w:color="BFBFBF" w:sz="4"/>
@@ -21968,7 +22041,7 @@
         </w:trPr>
         <w:tc>
           <w:tcPr>
-            <w:tcW w:type="dxa" w:w="2591"/>
+            <w:tcW w:type="dxa" w:w="2705"/>
             <w:tcBorders>
               <w:top w:val="single" w:color="BFBFBF" w:sz="4"/>
               <w:left w:val="single" w:color="BFBFBF" w:sz="4"/>
@@ -22000,7 +22073,7 @@
         </w:tc>
         <w:tc>
           <w:tcPr>
-            <w:tcW w:type="dxa" w:w="6480"/>
+            <w:tcW w:type="dxa" w:w="6366"/>
             <w:tcBorders>
               <w:top w:val="single" w:color="BFBFBF" w:sz="4"/>
               <w:left w:val="single" w:color="BFBFBF" w:sz="4"/>
@@ -22025,7 +22098,7 @@
                 <w:sz w:val="20"/>
                 <w:szCs w:val="20"/>
               </w:rPr>
-              <w:t xml:space="preserve">Cùng đầu vào; trả hệ số chặn, đóng góp log-odds của từng biến và đường xác suất theo lead time (cho biểu đồ giải thích)</w:t>
+              <w:t xml:space="preserve">Cùng đầu vào; trả hệ số chặn, đóng góp log-odds của từng biến và đường xác suất theo lead time</w:t>
             </w:r>
           </w:p>
         </w:tc>
@@ -22036,7 +22109,7 @@
         </w:trPr>
         <w:tc>
           <w:tcPr>
-            <w:tcW w:type="dxa" w:w="2591"/>
+            <w:tcW w:type="dxa" w:w="2705"/>
             <w:tcBorders>
               <w:top w:val="single" w:color="BFBFBF" w:sz="4"/>
               <w:left w:val="single" w:color="BFBFBF" w:sz="4"/>
@@ -22068,7 +22141,7 @@
         </w:tc>
         <w:tc>
           <w:tcPr>
-            <w:tcW w:type="dxa" w:w="6480"/>
+            <w:tcW w:type="dxa" w:w="6366"/>
             <w:tcBorders>
               <w:top w:val="single" w:color="BFBFBF" w:sz="4"/>
               <w:left w:val="single" w:color="BFBFBF" w:sz="4"/>
@@ -22093,7 +22166,7 @@
                 <w:sz w:val="20"/>
                 <w:szCs w:val="20"/>
               </w:rPr>
-              <w:t xml:space="preserve">Schema đầu vào (JSON Schema), ngưỡng, metric validation/test, phiên bản</w:t>
+              <w:t xml:space="preserve">Phiên bản, ngưỡng, danh sách trường đầu vào (kiểu, đơn vị, miền cho phép, miền train, hạng mục hợp lệ), booking mẫu, biến đã loại</w:t>
             </w:r>
           </w:p>
         </w:tc>
@@ -22104,7 +22177,7 @@
         </w:trPr>
         <w:tc>
           <w:tcPr>
-            <w:tcW w:type="dxa" w:w="2591"/>
+            <w:tcW w:type="dxa" w:w="2705"/>
             <w:tcBorders>
               <w:top w:val="single" w:color="BFBFBF" w:sz="4"/>
               <w:left w:val="single" w:color="BFBFBF" w:sz="4"/>
@@ -22130,51 +22203,13 @@
                 <w:sz w:val="16"/>
                 <w:szCs w:val="16"/>
               </w:rPr>
-              <w:t xml:space="preserve">GET /</w:t>
-            </w:r>
-            <w:r>
-              <w:rPr>
-                <w:b w:val="false"/>
-                <w:bCs w:val="false"/>
-                <w:sz w:val="20"/>
-                <w:szCs w:val="20"/>
-              </w:rPr>
-              <w:t xml:space="preserve">, </w:t>
-            </w:r>
-            <w:r>
-              <w:rPr>
-                <w:rFonts w:ascii="Courier New" w:cs="Courier New" w:eastAsia="Courier New" w:hAnsi="Courier New"/>
-                <w:b w:val="false"/>
-                <w:bCs w:val="false"/>
-                <w:sz w:val="16"/>
-                <w:szCs w:val="16"/>
-              </w:rPr>
-              <w:t xml:space="preserve">/predict</w:t>
-            </w:r>
-            <w:r>
-              <w:rPr>
-                <w:b w:val="false"/>
-                <w:bCs w:val="false"/>
-                <w:sz w:val="20"/>
-                <w:szCs w:val="20"/>
-              </w:rPr>
-              <w:t xml:space="preserve">, </w:t>
-            </w:r>
-            <w:r>
-              <w:rPr>
-                <w:rFonts w:ascii="Courier New" w:cs="Courier New" w:eastAsia="Courier New" w:hAnsi="Courier New"/>
-                <w:b w:val="false"/>
-                <w:bCs w:val="false"/>
-                <w:sz w:val="16"/>
-                <w:szCs w:val="16"/>
-              </w:rPr>
-              <w:t xml:space="preserve">/dashboard</w:t>
-            </w:r>
-          </w:p>
-        </w:tc>
-        <w:tc>
-          <w:tcPr>
-            <w:tcW w:type="dxa" w:w="6480"/>
+              <w:t xml:space="preserve">GET /api/metrics</w:t>
+            </w:r>
+          </w:p>
+        </w:tc>
+        <w:tc>
+          <w:tcPr>
+            <w:tcW w:type="dxa" w:w="6366"/>
             <w:tcBorders>
               <w:top w:val="single" w:color="BFBFBF" w:sz="4"/>
               <w:left w:val="single" w:color="BFBFBF" w:sz="4"/>
@@ -22199,7 +22234,7 @@
                 <w:sz w:val="20"/>
                 <w:szCs w:val="20"/>
               </w:rPr>
-              <w:t xml:space="preserve">Ba màn hình: giới thiệu, dự đoán, đánh giá và model card</w:t>
+              <w:t xml:space="preserve">Metric validation/test, đường ROC/PR, reliability theo bin, đường precision/recall theo ngưỡng, odds ratio, sai số theo nhóm</w:t>
             </w:r>
           </w:p>
         </w:tc>
@@ -22210,7 +22245,7 @@
         </w:trPr>
         <w:tc>
           <w:tcPr>
-            <w:tcW w:type="dxa" w:w="2591"/>
+            <w:tcW w:type="dxa" w:w="2705"/>
             <w:tcBorders>
               <w:top w:val="single" w:color="BFBFBF" w:sz="4"/>
               <w:left w:val="single" w:color="BFBFBF" w:sz="4"/>
@@ -22236,7 +22271,7 @@
                 <w:sz w:val="16"/>
                 <w:szCs w:val="16"/>
               </w:rPr>
-              <w:t xml:space="preserve">GET /docs</w:t>
+              <w:t xml:space="preserve">GET /api/model-card</w:t>
             </w:r>
             <w:r>
               <w:rPr>
@@ -22255,13 +22290,13 @@
                 <w:sz w:val="16"/>
                 <w:szCs w:val="16"/>
               </w:rPr>
-              <w:t xml:space="preserve">/model-card</w:t>
-            </w:r>
-          </w:p>
-        </w:tc>
-        <w:tc>
-          <w:tcPr>
-            <w:tcW w:type="dxa" w:w="6480"/>
+              <w:t xml:space="preserve">/api/data-card</w:t>
+            </w:r>
+          </w:p>
+        </w:tc>
+        <w:tc>
+          <w:tcPr>
+            <w:tcW w:type="dxa" w:w="6366"/>
             <w:tcBorders>
               <w:top w:val="single" w:color="BFBFBF" w:sz="4"/>
               <w:left w:val="single" w:color="BFBFBF" w:sz="4"/>
@@ -22286,7 +22321,113 @@
                 <w:sz w:val="20"/>
                 <w:szCs w:val="20"/>
               </w:rPr>
-              <w:t xml:space="preserve">Tài liệu OpenAPI tự sinh kèm ví dụ; model card đầy đủ</w:t>
+              <w:t xml:space="preserve">Model card (markdown) và data card (nguồn, checksum, chất lượng, data dictionary)</w:t>
+            </w:r>
+          </w:p>
+        </w:tc>
+      </w:tr>
+      <w:tr>
+        <w:trPr>
+          <w:cantSplit/>
+        </w:trPr>
+        <w:tc>
+          <w:tcPr>
+            <w:tcW w:type="dxa" w:w="2705"/>
+            <w:tcBorders>
+              <w:top w:val="single" w:color="BFBFBF" w:sz="4"/>
+              <w:left w:val="single" w:color="BFBFBF" w:sz="4"/>
+              <w:bottom w:val="single" w:color="BFBFBF" w:sz="4"/>
+              <w:right w:val="single" w:color="BFBFBF" w:sz="4"/>
+            </w:tcBorders>
+            <w:tcMar>
+              <w:top w:type="dxa" w:w="40"/>
+              <w:left w:type="dxa" w:w="80"/>
+              <w:bottom w:type="dxa" w:w="40"/>
+              <w:right w:type="dxa" w:w="80"/>
+            </w:tcMar>
+          </w:tcPr>
+          <w:p>
+            <w:pPr>
+              <w:jc w:val="left"/>
+            </w:pPr>
+            <w:r>
+              <w:rPr>
+                <w:rFonts w:ascii="Courier New" w:cs="Courier New" w:eastAsia="Courier New" w:hAnsi="Courier New"/>
+                <w:b w:val="false"/>
+                <w:bCs w:val="false"/>
+                <w:sz w:val="16"/>
+                <w:szCs w:val="16"/>
+              </w:rPr>
+              <w:t xml:space="preserve">GET /api/health</w:t>
+            </w:r>
+            <w:r>
+              <w:rPr>
+                <w:b w:val="false"/>
+                <w:bCs w:val="false"/>
+                <w:sz w:val="20"/>
+                <w:szCs w:val="20"/>
+              </w:rPr>
+              <w:t xml:space="preserve">, </w:t>
+            </w:r>
+            <w:r>
+              <w:rPr>
+                <w:rFonts w:ascii="Courier New" w:cs="Courier New" w:eastAsia="Courier New" w:hAnsi="Courier New"/>
+                <w:b w:val="false"/>
+                <w:bCs w:val="false"/>
+                <w:sz w:val="16"/>
+                <w:szCs w:val="16"/>
+              </w:rPr>
+              <w:t xml:space="preserve">/api/files/…</w:t>
+            </w:r>
+            <w:r>
+              <w:rPr>
+                <w:b w:val="false"/>
+                <w:bCs w:val="false"/>
+                <w:sz w:val="20"/>
+                <w:szCs w:val="20"/>
+              </w:rPr>
+              <w:t xml:space="preserve">, </w:t>
+            </w:r>
+            <w:r>
+              <w:rPr>
+                <w:rFonts w:ascii="Courier New" w:cs="Courier New" w:eastAsia="Courier New" w:hAnsi="Courier New"/>
+                <w:b w:val="false"/>
+                <w:bCs w:val="false"/>
+                <w:sz w:val="16"/>
+                <w:szCs w:val="16"/>
+              </w:rPr>
+              <w:t xml:space="preserve">/docs</w:t>
+            </w:r>
+          </w:p>
+        </w:tc>
+        <w:tc>
+          <w:tcPr>
+            <w:tcW w:type="dxa" w:w="6366"/>
+            <w:tcBorders>
+              <w:top w:val="single" w:color="BFBFBF" w:sz="4"/>
+              <w:left w:val="single" w:color="BFBFBF" w:sz="4"/>
+              <w:bottom w:val="single" w:color="BFBFBF" w:sz="4"/>
+              <w:right w:val="single" w:color="BFBFBF" w:sz="4"/>
+            </w:tcBorders>
+            <w:tcMar>
+              <w:top w:type="dxa" w:w="40"/>
+              <w:left w:type="dxa" w:w="80"/>
+              <w:bottom w:type="dxa" w:w="40"/>
+              <w:right w:type="dxa" w:w="80"/>
+            </w:tcMar>
+          </w:tcPr>
+          <w:p>
+            <w:pPr>
+              <w:jc w:val="left"/>
+            </w:pPr>
+            <w:r>
+              <w:rPr>
+                <w:b w:val="false"/>
+                <w:bCs w:val="false"/>
+                <w:sz w:val="20"/>
+                <w:szCs w:val="20"/>
+              </w:rPr>
+              <w:t xml:space="preserve">Kiểm tra kết nối; tải metrics.json, data_dictionary.csv, model_card.md; tài liệu OpenAPI kèm ví dụ</w:t>
             </w:r>
           </w:p>
         </w:tc>
@@ -22344,7 +22485,18 @@
         <w:t xml:space="preserve">country</w:t>
       </w:r>
       <w:r>
-        <w:t xml:space="preserve"> bị từ chối), có miền giá trị cho từng trường số và danh sách hạng mục hợp lệ khớp với dữ liệu train (có test kiểm tra). Không giá trị nào bị âm thầm thay thế.</w:t>
+        <w:t xml:space="preserve"> bị từ chối), có miền giá trị cho từng trường số và danh sách hạng mục hợp lệ khớp với dữ liệu train (có test kiểm tra). Form trên giao diện dựng schema Zod từ </w:t>
+      </w:r>
+      <w:r>
+        <w:rPr>
+          <w:rFonts w:ascii="Courier New" w:cs="Courier New" w:eastAsia="Courier New" w:hAnsi="Courier New"/>
+          <w:sz w:val="22"/>
+          <w:szCs w:val="22"/>
+        </w:rPr>
+        <w:t xml:space="preserve">/api/model-info</w:t>
+      </w:r>
+      <w:r>
+        <w:t xml:space="preserve"> nên dùng cùng miền giá trị, báo lỗi ngay dưới ô và không gửi khi thiếu trường hoặc sai kiểu. Giá trị hợp lệ nhưng ngoài miền train vẫn được gửi, kèm nhãn "ngoài miền" và cảnh báo từ API. Không giá trị nào bị âm thầm thay thế.</w:t>
       </w:r>
     </w:p>
     <w:p>
@@ -23097,7 +23249,38 @@
         <w:keepNext/>
       </w:pPr>
       <w:r>
-        <w:t xml:space="preserve">9.3 Ba màn hình</w:t>
+        <w:t xml:space="preserve">9.3 Giao diện</w:t>
+      </w:r>
+    </w:p>
+    <w:p>
+      <w:pPr>
+        <w:spacing w:after="120" w:line="312"/>
+        <w:jc w:val="both"/>
+      </w:pPr>
+      <w:r>
+        <w:t xml:space="preserve">Bố cục kiểu bento: sidebar dạng cây (thu thành cột icon ở màn hình vừa, thành ngăn kéo trên điện thoại), ô tìm kiếm toàn cục </w:t>
+      </w:r>
+      <w:r>
+        <w:rPr>
+          <w:rFonts w:ascii="Courier New" w:cs="Courier New" w:eastAsia="Courier New" w:hAnsi="Courier New"/>
+          <w:sz w:val="22"/>
+          <w:szCs w:val="22"/>
+        </w:rPr>
+        <w:t xml:space="preserve">Ctrl/⌘ K</w:t>
+      </w:r>
+      <w:r>
+        <w:t xml:space="preserve"> tìm không dấu theo tên màn hình và tên biến (nhảy tới đúng dòng trong bảng odds ratio hoặc data dictionary). Từ 900 × 860 px trở lên mỗi trang vừa một màn hình, bảng cuộn bên trong khung. Có năm nhóm màn hình: Giới thiệu &amp; phạm vi, Dự đoán rủi ro, Đánh giá mô hình (tổng quan &amp; baseline, ngưỡng, calibration, odds ratio, phân tích lỗi), Model card (render nguyên văn </w:t>
+      </w:r>
+      <w:r>
+        <w:rPr>
+          <w:rFonts w:ascii="Courier New" w:cs="Courier New" w:eastAsia="Courier New" w:hAnsi="Courier New"/>
+          <w:sz w:val="22"/>
+          <w:szCs w:val="22"/>
+        </w:rPr>
+        <w:t xml:space="preserve">reports/model_card.md</w:t>
+      </w:r>
+      <w:r>
+        <w:t xml:space="preserve">) và Dữ liệu.</w:t>
       </w:r>
     </w:p>
     <w:p>
@@ -23109,9 +23292,9 @@
       <w:r>
         <w:drawing>
           <wp:inline distT="0" distB="0" distL="0" distR="0">
-            <wp:extent cx="4953000" cy="4448175"/>
+            <wp:extent cx="5334000" cy="3333750"/>
             <wp:effectExtent t="0" r="0" b="0" l="0"/>
-            <wp:docPr id="10" name="app_intro.png" descr="Màn hình giới thiệu: phạm vi, luồng xử lý, cách dùng có trách nhiệm." title="Hình 10"/>
+            <wp:docPr id="10" name="app_intro.png" descr="Màn hình giới thiệu: câu hỏi nghiên cứu, phạm vi dữ liệu, cách dùng có trách nhiệm và các biến đã loại (kèm lý do khi rê chuột)." title="Hình 10"/>
             <wp:cNvGraphicFramePr>
               <a:graphicFrameLocks xmlns:a="http://schemas.openxmlformats.org/drawingml/2006/main" noChangeAspect="1"/>
             </wp:cNvGraphicFramePr>
@@ -23134,7 +23317,7 @@
                   <pic:spPr bwMode="auto">
                     <a:xfrm>
                       <a:off x="0" y="0"/>
-                      <a:ext cx="4953000" cy="4448175"/>
+                      <a:ext cx="5334000" cy="3333750"/>
                     </a:xfrm>
                     <a:prstGeom prst="rect">
                       <a:avLst/>
@@ -23168,7 +23351,7 @@
           <w:sz w:val="22"/>
           <w:szCs w:val="22"/>
         </w:rPr>
-        <w:t xml:space="preserve">Màn hình giới thiệu: phạm vi, luồng xử lý, cách dùng có trách nhiệm.</w:t>
+        <w:t xml:space="preserve">Màn hình giới thiệu: câu hỏi nghiên cứu, phạm vi dữ liệu, cách dùng có trách nhiệm và các biến đã loại (kèm lý do khi rê chuột).</w:t>
       </w:r>
       <w:r>
         <w:rPr>
@@ -23176,7 +23359,7 @@
           <w:sz w:val="20"/>
           <w:szCs w:val="20"/>
         </w:rPr>
-        <w:t xml:space="preserve"> Nguồn: ảnh chụp ứng dụng (app/static/index.html).</w:t>
+        <w:t xml:space="preserve"> Nguồn: ảnh chụp ứng dụng (frontend/src/pages/intro.tsx).</w:t>
       </w:r>
     </w:p>
     <w:p>
@@ -23195,7 +23378,7 @@
         <w:t xml:space="preserve">dự đoán</w:t>
       </w:r>
       <w:r>
-        <w:t xml:space="preserve"> sinh form từ JSON Schema của API nên đơn vị, miền giá trị và danh sách hạng mục luôn khớp backend. Lỗi hiển thị ngay dưới từng trường. Kết quả gồm xác suất, nhóm ưu tiên (có nhãn chữ và ký hiệu, không chỉ dựa vào màu), hành động gợi ý, thang ba ngưỡng, cảnh báo đầu vào và hai biểu đồ giải thích: đóng góp của từng biến vào log-odds (tổng đóng góp qua hàm sigmoid cho đúng xác suất) và đường xác suất khi chỉ thay đổi lead time. Có bốn booking mẫu giả lập để demo nhanh, trong đó một mẫu cố ý nằm ngoài miền.</w:t>
+        <w:t xml:space="preserve"> chia form thành bốn nhóm (thông tin đặt phòng, khách, kênh &amp; loại phòng, lịch sử); mỗi trường có nhãn tiếng Việt kèm tên biến, đơn vị và miền giá trị theo train. Khung kết quả gồm xác suất (đếm lên), nhóm ưu tiên xác nhận, thanh xác suất với ba vạch ngưỡng, cảnh báo từ API, dòng chú thích cố định, phần JSON request/response có nút sao chép và phần giải thích đóng góp log-odds. Ba booking mẫu giả lập (rủi ro thấp/trung bình/cao) và một mẫu ngoài miền lấy từ backend.</w:t>
       </w:r>
     </w:p>
     <w:p>
@@ -23207,9 +23390,9 @@
       <w:r>
         <w:drawing>
           <wp:inline distT="0" distB="0" distL="0" distR="0">
-            <wp:extent cx="4476750" cy="6019800"/>
+            <wp:extent cx="5334000" cy="3333750"/>
             <wp:effectExtent t="0" r="0" b="0" l="0"/>
-            <wp:docPr id="11" name="app_predict_ood.png" descr="Màn hình dự đoán với booking mẫu ngoài miền (lead time 900 ngày): xác suất, nhóm ưu tiên, cảnh báo và biểu đồ giải thích." title="Hình 11"/>
+            <wp:docPr id="11" name="app_predict.png" descr="Màn hình dự đoán với booking mẫu rủi ro cao: xác suất 99,8%, nhóm ưu tiên xác nhận rất cao, thanh ba ngưỡng." title="Hình 11"/>
             <wp:cNvGraphicFramePr>
               <a:graphicFrameLocks xmlns:a="http://schemas.openxmlformats.org/drawingml/2006/main" noChangeAspect="1"/>
             </wp:cNvGraphicFramePr>
@@ -23232,7 +23415,7 @@
                   <pic:spPr bwMode="auto">
                     <a:xfrm>
                       <a:off x="0" y="0"/>
-                      <a:ext cx="4476750" cy="6019800"/>
+                      <a:ext cx="5334000" cy="3333750"/>
                     </a:xfrm>
                     <a:prstGeom prst="rect">
                       <a:avLst/>
@@ -23266,7 +23449,7 @@
           <w:sz w:val="22"/>
           <w:szCs w:val="22"/>
         </w:rPr>
-        <w:t xml:space="preserve">Màn hình dự đoán với booking mẫu ngoài miền (lead time 900 ngày): xác suất, nhóm ưu tiên, cảnh báo và biểu đồ giải thích.</w:t>
+        <w:t xml:space="preserve">Màn hình dự đoán với booking mẫu rủi ro cao: xác suất 99,8%, nhóm ưu tiên xác nhận rất cao, thanh ba ngưỡng.</w:t>
       </w:r>
       <w:r>
         <w:rPr>
@@ -23274,7 +23457,7 @@
           <w:sz w:val="20"/>
           <w:szCs w:val="20"/>
         </w:rPr>
-        <w:t xml:space="preserve"> Nguồn: ảnh chụp ứng dụng (app/static/predict.html).</w:t>
+        <w:t xml:space="preserve"> Nguồn: ảnh chụp ứng dụng (frontend/src/pages/predict.tsx).</w:t>
       </w:r>
     </w:p>
     <w:p>
@@ -23286,9 +23469,9 @@
       <w:r>
         <w:drawing>
           <wp:inline distT="0" distB="0" distL="0" distR="0">
-            <wp:extent cx="4476750" cy="4543425"/>
+            <wp:extent cx="5334000" cy="3333750"/>
             <wp:effectExtent t="0" r="0" b="0" l="0"/>
-            <wp:docPr id="12" name="app_dashboard.png" descr="Màn hình đánh giá và model card: metric test, so sánh baseline, calibration, ba ngưỡng." title="Hình 12"/>
+            <wp:docPr id="12" name="app_dashboard.png" descr="Màn hình tổng quan &amp; baseline: bốn KPI trên test so với baseline tốt nhất, bảng so sánh hai cấp Validation/Test, đường ROC và PR." title="Hình 12"/>
             <wp:cNvGraphicFramePr>
               <a:graphicFrameLocks xmlns:a="http://schemas.openxmlformats.org/drawingml/2006/main" noChangeAspect="1"/>
             </wp:cNvGraphicFramePr>
@@ -23311,7 +23494,7 @@
                   <pic:spPr bwMode="auto">
                     <a:xfrm>
                       <a:off x="0" y="0"/>
-                      <a:ext cx="4476750" cy="4543425"/>
+                      <a:ext cx="5334000" cy="3333750"/>
                     </a:xfrm>
                     <a:prstGeom prst="rect">
                       <a:avLst/>
@@ -23345,7 +23528,7 @@
           <w:sz w:val="22"/>
           <w:szCs w:val="22"/>
         </w:rPr>
-        <w:t xml:space="preserve">Màn hình đánh giá và model card: metric test, so sánh baseline, calibration, ba ngưỡng.</w:t>
+        <w:t xml:space="preserve">Màn hình tổng quan &amp; baseline: bốn KPI trên test so với baseline tốt nhất, bảng so sánh hai cấp Validation/Test, đường ROC và PR.</w:t>
       </w:r>
       <w:r>
         <w:rPr>
@@ -23353,7 +23536,7 @@
           <w:sz w:val="20"/>
           <w:szCs w:val="20"/>
         </w:rPr>
-        <w:t xml:space="preserve"> Nguồn: ảnh chụp ứng dụng (app/static/dashboard.html).</w:t>
+        <w:t xml:space="preserve"> Nguồn: ảnh chụp ứng dụng (frontend/src/pages/evaluation.tsx).</w:t>
       </w:r>
     </w:p>
     <w:p>
@@ -23371,7 +23554,7 @@
         <w:jc w:val="both"/>
       </w:pPr>
       <w:r>
-        <w:t xml:space="preserve">Bộ test gồm 40 test chạy bằng </w:t>
+        <w:t xml:space="preserve">Bộ test gồm 51 test chạy bằng </w:t>
       </w:r>
       <w:r>
         <w:rPr>
@@ -23382,7 +23565,38 @@
         <w:t xml:space="preserve">make test</w:t>
       </w:r>
       <w:r>
-        <w:t xml:space="preserve">: 6 test leakage, 7 test tiền xử lý (chia theo thời gian, làm sạch, pipeline chỉ học từ train, hạng mục chưa gặp, ngưỡng) và 27 test API (request hợp lệ, nhóm rủi ro khớp ngưỡng, thiếu trường → 400, sai kiểu → 422, ngoài miền → 422, trường lạ, JSON hỏng, cảnh báo, lỗi 500 an toàn, schema khớp dữ liệu train, phép tách log-odds chính xác, các trang tải được).</w:t>
+        <w:t xml:space="preserve">: 6 test leakage, 7 test tiền xử lý (chia theo thời gian, làm sạch, pipeline chỉ học từ train, hạng mục chưa gặp, ngưỡng) và 38 test API (request hợp lệ, nhóm rủi ro khớp ngưỡng, thiếu trường → 400, sai kiểu → 422, ngoài miền → 422, trường lạ, JSON hỏng, cảnh báo, lỗi 500 an toàn, schema khớp dữ liệu train, phép tách log-odds chính xác, booking mẫu đúng nhóm, endpoint chỉ đọc, chỉ tải được tệp trong danh sách cho phép, route giao diện không lộ tệp ngoài thư mục build).</w:t>
+      </w:r>
+    </w:p>
+    <w:p>
+      <w:pPr>
+        <w:spacing w:after="120" w:line="312"/>
+        <w:jc w:val="both"/>
+      </w:pPr>
+      <w:r>
+        <w:t xml:space="preserve">Ngoài ra, </w:t>
+      </w:r>
+      <w:r>
+        <w:rPr>
+          <w:rFonts w:ascii="Courier New" w:cs="Courier New" w:eastAsia="Courier New" w:hAnsi="Courier New"/>
+          <w:sz w:val="22"/>
+          <w:szCs w:val="22"/>
+        </w:rPr>
+        <w:t xml:space="preserve">npm run e2e</w:t>
+      </w:r>
+      <w:r>
+        <w:t xml:space="preserve"> (thư mục </w:t>
+      </w:r>
+      <w:r>
+        <w:rPr>
+          <w:rFonts w:ascii="Courier New" w:cs="Courier New" w:eastAsia="Courier New" w:hAnsi="Courier New"/>
+          <w:sz w:val="22"/>
+          <w:szCs w:val="22"/>
+        </w:rPr>
+        <w:t xml:space="preserve">frontend</w:t>
+      </w:r>
+      <w:r>
+        <w:t xml:space="preserve">) điều khiển Chrome headless qua 17 kịch bản: điền booking mẫu → dự đoán → xem nhóm ưu tiên → sang dashboard → model card; input xấu (để trống, chữ trong ô số, số âm, số thập phân, giá trị ngoài miền, hạng mục không hợp lệ gửi thẳng qua API) không làm sập app và báo lỗi đúng chỗ; tìm kiếm không dấu; ngăn kéo điều hướng ở 390 px. Kịch bản cũng kiểm tra không có lỗi console và trang không cuộn ở 1440 × 900.</w:t>
       </w:r>
     </w:p>
     <w:p>
@@ -23429,7 +23643,7 @@
         <w:t xml:space="preserve">reports/model_card.md</w:t>
       </w:r>
       <w:r>
-        <w:t xml:space="preserve">) và cả ba màn hình đều nêu các sử dụng bị cấm: tự động hủy hay từ chối khách, tăng giá hoặc đòi đặt cọc dựa trên điểm rủi ro, phân biệt đối xử theo bất kỳ đặc điểm nào. Kết quả gắn cờ chỉ dẫn tới một cuộc gọi, không dẫn tới bất lợi cho khách; quyết định cuối cùng thuộc về nhân viên.</w:t>
+        <w:t xml:space="preserve">) và giao diện (trang giới thiệu, dòng chú thích ở kết quả dự đoán) đều nêu các sử dụng bị cấm: tự động hủy hay từ chối khách, tăng giá hoặc đòi đặt cọc dựa trên điểm rủi ro, phân biệt đối xử theo bất kỳ đặc điểm nào. Kết quả gắn cờ chỉ dẫn tới một cuộc gọi, không dẫn tới bất lợi cho khách; quyết định cuối cùng thuộc về nhân viên.</w:t>
       </w:r>
     </w:p>
     <w:p>
@@ -23881,7 +24095,7 @@
           <w:sz w:val="19"/>
           <w:szCs w:val="19"/>
         </w:rPr>
-        <w:t xml:space="preserve">git clone &lt;link-repo&gt; &amp;&amp; cd &lt;thư-mục-repo&gt;</w:t>
+        <w:t xml:space="preserve">git clone https://github.com/Nguyenvan01/hotel-booking-cancellation-prediction.git &amp;&amp; cd hotel-booking-cancellation-prediction</w:t>
       </w:r>
     </w:p>
     <w:p>
@@ -36743,7 +36957,7 @@
         <w:t xml:space="preserve">make app</w:t>
       </w:r>
       <w:r>
-        <w:t xml:space="preserve">, mở trang Giới thiệu: mục tiêu, phạm vi, sơ đồ luồng, cảnh báo sử dụng có trách nhiệm.</w:t>
+        <w:t xml:space="preserve">, mở http://localhost:8000: trang Giới thiệu (câu hỏi, phạm vi, cách dùng có trách nhiệm); rê chuột vào một biến đã loại để xem lý do.</w:t>
       </w:r>
     </w:p>
     <w:p>
@@ -36757,7 +36971,7 @@
         <w:jc w:val="both"/>
       </w:pPr>
       <w:r>
-        <w:t xml:space="preserve">(0:45–2:30) Trang Dự đoán: bấm "Khách quen, đặt sát ngày" (nhóm Thấp), rồi "Đoàn đặt sớm, từng hủy" (Rất cao). Giải thích biểu đồ đóng góp log-odds và đường lead time.</w:t>
+        <w:t xml:space="preserve">(0:45–2:30) Trang Dự đoán: "Điền booking mẫu" → "Rủi ro thấp" → Dự đoán (nhóm thấp); rồi "Rủi ro cao" (nhóm rất cao). Chỉ thanh ba ngưỡng, mở "Vì sao ra kết quả này?" để giải thích đóng góp log-odds.</w:t>
       </w:r>
     </w:p>
     <w:p>
@@ -36771,7 +36985,7 @@
         <w:jc w:val="both"/>
       </w:pPr>
       <w:r>
-        <w:t xml:space="preserve">(2:30–3:30) Bấm mẫu "Ngoài miền": xác suất vẫn trả về nhưng có cảnh báo và vùng xám "ngoài miền train". Xóa trường Lead time rồi gửi: lỗi "Thiếu trường bắt buộc"; nhập 1.5: lỗi "Phải là số nguyên".</w:t>
+        <w:t xml:space="preserve">(2:30–3:30) Input xấu: gõ chữ vào ô lead time → "Phải là số nguyên"; xóa trống → "Thiếu trường bắt buộc"; nhập 900 → nhãn "ngoài miền", vẫn gửi được và hiện cảnh báo từ API. Mở "Request/Response JSON", bấm Sao chép.</w:t>
       </w:r>
     </w:p>
     <w:p>
@@ -36785,40 +36999,7 @@
         <w:jc w:val="both"/>
       </w:pPr>
       <w:r>
-        <w:t xml:space="preserve">(3:30–4:30) Mở </w:t>
-      </w:r>
-      <w:r>
-        <w:rPr>
-          <w:rFonts w:ascii="Courier New" w:cs="Courier New" w:eastAsia="Courier New" w:hAnsi="Courier New"/>
-          <w:sz w:val="22"/>
-          <w:szCs w:val="22"/>
-        </w:rPr>
-        <w:t xml:space="preserve">/docs</w:t>
-      </w:r>
-      <w:r>
-        <w:t xml:space="preserve">: thử </w:t>
-      </w:r>
-      <w:r>
-        <w:rPr>
-          <w:rFonts w:ascii="Courier New" w:cs="Courier New" w:eastAsia="Courier New" w:hAnsi="Courier New"/>
-          <w:sz w:val="22"/>
-          <w:szCs w:val="22"/>
-        </w:rPr>
-        <w:t xml:space="preserve">POST /api/cancellation-risk</w:t>
-      </w:r>
-      <w:r>
-        <w:t xml:space="preserve"> với ví dụ có sẵn; gửi thêm trường </w:t>
-      </w:r>
-      <w:r>
-        <w:rPr>
-          <w:rFonts w:ascii="Courier New" w:cs="Courier New" w:eastAsia="Courier New" w:hAnsi="Courier New"/>
-          <w:sz w:val="22"/>
-          <w:szCs w:val="22"/>
-        </w:rPr>
-        <w:t xml:space="preserve">country</w:t>
-      </w:r>
-      <w:r>
-        <w:t xml:space="preserve"> để thấy lỗi 422.</w:t>
+        <w:t xml:space="preserve">(3:30–4:30) Nhấn Ctrl/⌘ K, gõ không dấu "thoi gian dat truoc" → nhảy tới dòng lead_time trong bảng odds ratio; nhấn mạnh chú thích "không phải tác động nhân quả". Mở /docs, gửi thêm trường country để thấy lỗi 422.</w:t>
       </w:r>
     </w:p>
     <w:p>
@@ -36832,7 +37013,7 @@
         <w:jc w:val="both"/>
       </w:pPr>
       <w:r>
-        <w:t xml:space="preserve">(4:30–6:30) Trang Đánh giá: so sánh baseline, calibration, ba ngưỡng (precision/recall/gắn cờ), hiệu năng theo nhóm và theo tháng, model card tóm tắt.</w:t>
+        <w:t xml:space="preserve">(4:30–6:30) Đánh giá mô hình: Tổng quan (KPI so với baseline, bảng Validation/Test), Ngưỡng (ba ma trận nhầm lẫn, kéo thanh trượt khám phá), Calibration, Phân tích lỗi (Resort, Online TA, theo tháng); kết thúc ở Model card.</w:t>
       </w:r>
     </w:p>
     <w:p>
@@ -36888,7 +37069,7 @@
         <w:t xml:space="preserve">Khai báo công cụ AI:</w:t>
       </w:r>
       <w:r>
-        <w:t xml:space="preserve"> nhóm sử dụng Claude Code (Claude Opus 5.5, Anthropic) để rà soát repo so với tài liệu giao nhiệm vụ, viết lại pipeline dữ liệu/mô hình/đánh giá, ứng dụng web, test tự động và soạn bản nháp tài liệu, báo cáo. Cách kiểm chứng: chạy lại toàn bộ pipeline trên môi trường sạch; 40 test tự động; đối chiếu mọi con số trong báo cáo với </w:t>
+        <w:t xml:space="preserve"> nhóm sử dụng Claude Code (Claude Opus 5.5, Anthropic) để rà soát repo so với tài liệu giao nhiệm vụ, viết lại pipeline dữ liệu/mô hình/đánh giá, ứng dụng web, test tự động và soạn bản nháp tài liệu, báo cáo. Cách kiểm chứng: chạy lại toàn bộ pipeline trên môi trường sạch; 51 test tự động và 17 kịch bản end-to-end; đối chiếu mọi con số trong báo cáo với </w:t>
       </w:r>
       <w:r>
         <w:rPr>

</xml_diff>